<commit_message>
add what's next text; fix coversheet info and template; prep for updated survey embed method
</commit_message>
<xml_diff>
--- a/docassemble/MLHObjectionToGarnishment/data/templates/Instructions_-_Objection_to_Garnishment.docx
+++ b/docassemble/MLHObjectionToGarnishment/data/templates/Instructions_-_Objection_to_Garnishment.docx
@@ -2431,27 +2431,29 @@
   </w:style>
   <w:style w:type="paragraph" w:styleId="Heading1">
     <w:name w:val="heading 1"/>
-    <w:basedOn w:val="Normal"/>
+    <w:basedOn w:val="Heading2"/>
     <w:next w:val="Normal"/>
+    <w:link w:val="Heading1Char"/>
     <w:uiPriority w:val="9"/>
     <w:qFormat/>
+    <w:rsid w:val="0032758E"/>
     <w:pPr>
-      <w:keepNext/>
-      <w:keepLines/>
       <w:shd w:val="clear" w:color="auto" w:fill="FFFFFF"/>
-      <w:spacing w:before="240" w:after="160"/>
+      <w:spacing w:before="120" w:after="0" w:line="259" w:lineRule="auto"/>
       <w:outlineLvl w:val="0"/>
     </w:pPr>
     <w:rPr>
-      <w:rFonts w:ascii="Calibri" w:eastAsia="Calibri" w:hAnsi="Calibri" w:cs="Calibri"/>
-      <w:b/>
+      <w:rFonts w:ascii="Aptos" w:hAnsi="Aptos"/>
+      <w:b w:val="0"/>
       <w:color w:val="222222"/>
+      <w:sz w:val="30"/>
     </w:rPr>
   </w:style>
   <w:style w:type="paragraph" w:styleId="Heading2">
     <w:name w:val="heading 2"/>
     <w:basedOn w:val="Normal"/>
     <w:next w:val="Normal"/>
+    <w:link w:val="Heading2Char"/>
     <w:uiPriority w:val="9"/>
     <w:unhideWhenUsed/>
     <w:qFormat/>
@@ -2603,6 +2605,34 @@
       <w:color w:val="666666"/>
       <w:sz w:val="30"/>
       <w:szCs w:val="30"/>
+    </w:rPr>
+  </w:style>
+  <w:style w:type="character" w:customStyle="1" w:styleId="Heading2Char">
+    <w:name w:val="Heading 2 Char"/>
+    <w:basedOn w:val="DefaultParagraphFont"/>
+    <w:link w:val="Heading2"/>
+    <w:uiPriority w:val="9"/>
+    <w:rsid w:val="0032758E"/>
+    <w:rPr>
+      <w:rFonts w:ascii="Calibri" w:eastAsia="Calibri" w:hAnsi="Calibri" w:cs="Calibri"/>
+      <w:b/>
+      <w:sz w:val="32"/>
+      <w:szCs w:val="32"/>
+    </w:rPr>
+  </w:style>
+  <w:style w:type="character" w:customStyle="1" w:styleId="Heading1Char">
+    <w:name w:val="Heading 1 Char"/>
+    <w:basedOn w:val="Heading2Char"/>
+    <w:link w:val="Heading1"/>
+    <w:uiPriority w:val="9"/>
+    <w:rsid w:val="0032758E"/>
+    <w:rPr>
+      <w:rFonts w:ascii="Aptos" w:eastAsia="Calibri" w:hAnsi="Aptos" w:cs="Calibri"/>
+      <w:b w:val="0"/>
+      <w:color w:val="222222"/>
+      <w:sz w:val="30"/>
+      <w:szCs w:val="32"/>
+      <w:shd w:val="clear" w:color="auto" w:fill="FFFFFF"/>
     </w:rPr>
   </w:style>
 </w:styles>

</xml_diff>